<commit_message>
finalizing diploma word/md + updating the python scripts
</commit_message>
<xml_diff>
--- a/Դիպլոմային Բնապահպանություն.docx
+++ b/Դիպլոմային Բնապահպանություն.docx
@@ -12,8 +12,6 @@
           <w:lang w:val="af-ZA"/>
         </w:rPr>
       </w:pPr>
-      <w:bookmarkStart w:id="0" w:name="_GoBack"/>
-      <w:bookmarkEnd w:id="0"/>
       <w:r>
         <w:rPr>
           <w:rFonts w:ascii="Sylfaen" w:hAnsi="Sylfaen"/>
@@ -926,7 +924,7 @@
           <w:rFonts w:ascii="Sylfaen" w:hAnsi="Sylfaen"/>
           <w:b/>
           <w:sz w:val="28"/>
-          <w:lang w:val="af-ZA"/>
+          <w:lang w:val="hy-AM"/>
         </w:rPr>
       </w:pPr>
       <w:r>
@@ -934,8 +932,9 @@
           <w:rFonts w:ascii="Sylfaen" w:hAnsi="Sylfaen"/>
           <w:b/>
           <w:sz w:val="28"/>
-        </w:rPr>
-        <w:t>Ժամանակակից</w:t>
+          <w:lang w:val="hy-AM"/>
+        </w:rPr>
+        <w:t>ԺԱՄԱՆԱԿԱԿԻՑ</w:t>
       </w:r>
       <w:r>
         <w:rPr>
@@ -951,8 +950,9 @@
           <w:rFonts w:ascii="Sylfaen" w:hAnsi="Sylfaen"/>
           <w:b/>
           <w:sz w:val="28"/>
-        </w:rPr>
-        <w:t>սերվերային</w:t>
+          <w:lang w:val="hy-AM"/>
+        </w:rPr>
+        <w:t>ՍԵՐՎԵՐԱՅԻՆ</w:t>
       </w:r>
       <w:r>
         <w:rPr>
@@ -968,127 +968,9 @@
           <w:rFonts w:ascii="Sylfaen" w:hAnsi="Sylfaen"/>
           <w:b/>
           <w:sz w:val="28"/>
-        </w:rPr>
-        <w:t>համակարգերի</w:t>
-      </w:r>
-      <w:r>
-        <w:rPr>
-          <w:rFonts w:ascii="Sylfaen" w:hAnsi="Sylfaen"/>
-          <w:b/>
-          <w:sz w:val="28"/>
-          <w:lang w:val="af-ZA"/>
-        </w:rPr>
-        <w:t xml:space="preserve"> </w:t>
-      </w:r>
-      <w:r>
-        <w:rPr>
-          <w:rFonts w:ascii="Sylfaen" w:hAnsi="Sylfaen"/>
-          <w:b/>
-          <w:sz w:val="28"/>
-        </w:rPr>
-        <w:t>ազդեցությունը</w:t>
-      </w:r>
-      <w:r>
-        <w:rPr>
-          <w:rFonts w:ascii="Sylfaen" w:hAnsi="Sylfaen"/>
-          <w:b/>
-          <w:sz w:val="28"/>
-          <w:lang w:val="af-ZA"/>
-        </w:rPr>
-        <w:t xml:space="preserve"> </w:t>
-      </w:r>
-      <w:r>
-        <w:rPr>
-          <w:rFonts w:ascii="Sylfaen" w:hAnsi="Sylfaen"/>
-          <w:b/>
-          <w:sz w:val="28"/>
-        </w:rPr>
-        <w:t>էկոլոգիայի</w:t>
-      </w:r>
-      <w:r>
-        <w:rPr>
-          <w:rFonts w:ascii="Sylfaen" w:hAnsi="Sylfaen"/>
-          <w:b/>
-          <w:sz w:val="28"/>
-          <w:lang w:val="af-ZA"/>
-        </w:rPr>
-        <w:t xml:space="preserve"> </w:t>
-      </w:r>
-      <w:r>
-        <w:rPr>
-          <w:rFonts w:ascii="Sylfaen" w:hAnsi="Sylfaen"/>
-          <w:b/>
-          <w:sz w:val="28"/>
-        </w:rPr>
-        <w:t>վրա</w:t>
-      </w:r>
-      <w:r>
-        <w:rPr>
-          <w:rFonts w:ascii="Sylfaen" w:hAnsi="Sylfaen"/>
-          <w:b/>
-          <w:sz w:val="28"/>
-          <w:lang w:val="af-ZA"/>
-        </w:rPr>
-        <w:t xml:space="preserve"> </w:t>
-      </w:r>
-      <w:r>
-        <w:rPr>
-          <w:rFonts w:ascii="Sylfaen" w:hAnsi="Sylfaen"/>
-          <w:b/>
-          <w:sz w:val="28"/>
-        </w:rPr>
-        <w:t>և</w:t>
-      </w:r>
-      <w:r>
-        <w:rPr>
-          <w:rFonts w:ascii="Sylfaen" w:hAnsi="Sylfaen"/>
-          <w:b/>
-          <w:sz w:val="28"/>
-          <w:lang w:val="af-ZA"/>
-        </w:rPr>
-        <w:t xml:space="preserve"> </w:t>
-      </w:r>
-      <w:r>
-        <w:rPr>
-          <w:rFonts w:ascii="Sylfaen" w:hAnsi="Sylfaen"/>
-          <w:b/>
-          <w:sz w:val="28"/>
-        </w:rPr>
-        <w:t>կայուն</w:t>
-      </w:r>
-      <w:r>
-        <w:rPr>
-          <w:rFonts w:ascii="Sylfaen" w:hAnsi="Sylfaen"/>
-          <w:b/>
-          <w:sz w:val="28"/>
-          <w:lang w:val="af-ZA"/>
-        </w:rPr>
-        <w:t xml:space="preserve"> </w:t>
-      </w:r>
-      <w:r>
-        <w:rPr>
-          <w:rFonts w:ascii="Sylfaen" w:hAnsi="Sylfaen"/>
-          <w:b/>
-          <w:sz w:val="28"/>
-        </w:rPr>
-        <w:t>զարգացման</w:t>
-      </w:r>
-      <w:r>
-        <w:rPr>
-          <w:rFonts w:ascii="Sylfaen" w:hAnsi="Sylfaen"/>
-          <w:b/>
-          <w:sz w:val="28"/>
-          <w:lang w:val="af-ZA"/>
-        </w:rPr>
-        <w:t xml:space="preserve"> </w:t>
-      </w:r>
-      <w:r>
-        <w:rPr>
-          <w:rFonts w:ascii="Sylfaen" w:hAnsi="Sylfaen"/>
-          <w:b/>
-          <w:sz w:val="28"/>
-        </w:rPr>
-        <w:t>հեռանկարները</w:t>
+          <w:lang w:val="hy-AM"/>
+        </w:rPr>
+        <w:t>ՀԱՄԱԿԱՐԳԵՐԻ ԱԶԴԵՑՈՒԹՅՈՒՆԸ ԷԿՈԼՈԳԻԱՅԻ ՎՐԱ ԵՎ ԿԱՅՈՒՆ ԶԱՐԳԱՑՄԱՆ ՀԵՌԱՆԿԱՐՆԵՐԸ</w:t>
       </w:r>
     </w:p>
     <w:p>
@@ -1099,9 +981,11 @@
           <w:b/>
           <w:sz w:val="28"/>
           <w:szCs w:val="28"/>
-          <w:lang w:val="af-ZA"/>
+          <w:lang w:val="hy-AM"/>
         </w:rPr>
       </w:pPr>
+      <w:bookmarkStart w:id="0" w:name="_GoBack"/>
+      <w:bookmarkEnd w:id="0"/>
     </w:p>
     <w:p>
       <w:pPr>
@@ -2055,10 +1939,9 @@
           <w:b/>
           <w:color w:val="000000" w:themeColor="text1"/>
           <w:sz w:val="28"/>
-          <w:lang w:val="af-ZA"/>
+          <w:lang w:val="hy-AM"/>
         </w:rPr>
       </w:pPr>
-      <w:proofErr w:type="spellStart"/>
       <w:r>
         <w:rPr>
           <w:rFonts w:ascii="Sylfaen" w:eastAsia="Times New Roman" w:hAnsi="Sylfaen" w:cs="Segoe UI"/>
@@ -2069,9 +1952,19 @@
           <w:lang w:val="en-US" w:eastAsia="ru-RU"/>
         </w:rPr>
         <w:lastRenderedPageBreak/>
-        <w:t>Գլուխ</w:t>
-      </w:r>
-      <w:proofErr w:type="spellEnd"/>
+        <w:t>Գ</w:t>
+      </w:r>
+      <w:r>
+        <w:rPr>
+          <w:rFonts w:ascii="Sylfaen" w:eastAsia="Times New Roman" w:hAnsi="Sylfaen" w:cs="Segoe UI"/>
+          <w:b/>
+          <w:color w:val="000000" w:themeColor="text1"/>
+          <w:sz w:val="28"/>
+          <w:szCs w:val="28"/>
+          <w:lang w:val="hy-AM" w:eastAsia="ru-RU"/>
+        </w:rPr>
+        <w:t>ԼՈՒԽ</w:t>
+      </w:r>
       <w:r>
         <w:rPr>
           <w:rFonts w:ascii="Sylfaen" w:eastAsia="Times New Roman" w:hAnsi="Sylfaen" w:cs="Segoe UI"/>
@@ -2103,7 +1996,18 @@
           <w:szCs w:val="28"/>
           <w:lang w:val="af-ZA" w:eastAsia="ru-RU"/>
         </w:rPr>
-        <w:t xml:space="preserve"> Բնապահպանություն</w:t>
+        <w:t xml:space="preserve"> </w:t>
+      </w:r>
+      <w:r>
+        <w:rPr>
+          <w:rFonts w:ascii="Sylfaen" w:eastAsia="Times New Roman" w:hAnsi="Sylfaen" w:cs="Segoe UI"/>
+          <w:b/>
+          <w:color w:val="000000" w:themeColor="text1"/>
+          <w:sz w:val="28"/>
+          <w:szCs w:val="28"/>
+          <w:lang w:val="hy-AM" w:eastAsia="ru-RU"/>
+        </w:rPr>
+        <w:t>ԲՆԱՊԱՀՊԱՆՈՒԹՅՈՒՆ</w:t>
       </w:r>
     </w:p>
     <w:p>
@@ -2114,7 +2018,7 @@
           <w:rFonts w:ascii="Sylfaen" w:hAnsi="Sylfaen"/>
           <w:b/>
           <w:sz w:val="28"/>
-          <w:lang w:val="af-ZA"/>
+          <w:lang w:val="hy-AM"/>
         </w:rPr>
       </w:pPr>
       <w:r>
@@ -2122,8 +2026,9 @@
           <w:rFonts w:ascii="Sylfaen" w:hAnsi="Sylfaen"/>
           <w:b/>
           <w:sz w:val="28"/>
-        </w:rPr>
-        <w:t>Ժամանակակից</w:t>
+          <w:lang w:val="hy-AM"/>
+        </w:rPr>
+        <w:t>ԺԱՄԱՆԱԿԱԿԻՑ</w:t>
       </w:r>
       <w:r>
         <w:rPr>
@@ -2139,8 +2044,9 @@
           <w:rFonts w:ascii="Sylfaen" w:hAnsi="Sylfaen"/>
           <w:b/>
           <w:sz w:val="28"/>
-        </w:rPr>
-        <w:t>սերվերային</w:t>
+          <w:lang w:val="hy-AM"/>
+        </w:rPr>
+        <w:t>ՍԵՐՎԵՐԱՅԻՆ</w:t>
       </w:r>
       <w:r>
         <w:rPr>
@@ -2156,127 +2062,9 @@
           <w:rFonts w:ascii="Sylfaen" w:hAnsi="Sylfaen"/>
           <w:b/>
           <w:sz w:val="28"/>
-        </w:rPr>
-        <w:t>համակարգերի</w:t>
-      </w:r>
-      <w:r>
-        <w:rPr>
-          <w:rFonts w:ascii="Sylfaen" w:hAnsi="Sylfaen"/>
-          <w:b/>
-          <w:sz w:val="28"/>
-          <w:lang w:val="af-ZA"/>
-        </w:rPr>
-        <w:t xml:space="preserve"> </w:t>
-      </w:r>
-      <w:r>
-        <w:rPr>
-          <w:rFonts w:ascii="Sylfaen" w:hAnsi="Sylfaen"/>
-          <w:b/>
-          <w:sz w:val="28"/>
-        </w:rPr>
-        <w:t>ազդեցությունը</w:t>
-      </w:r>
-      <w:r>
-        <w:rPr>
-          <w:rFonts w:ascii="Sylfaen" w:hAnsi="Sylfaen"/>
-          <w:b/>
-          <w:sz w:val="28"/>
-          <w:lang w:val="af-ZA"/>
-        </w:rPr>
-        <w:t xml:space="preserve"> </w:t>
-      </w:r>
-      <w:r>
-        <w:rPr>
-          <w:rFonts w:ascii="Sylfaen" w:hAnsi="Sylfaen"/>
-          <w:b/>
-          <w:sz w:val="28"/>
-        </w:rPr>
-        <w:t>էկոլոգիայի</w:t>
-      </w:r>
-      <w:r>
-        <w:rPr>
-          <w:rFonts w:ascii="Sylfaen" w:hAnsi="Sylfaen"/>
-          <w:b/>
-          <w:sz w:val="28"/>
-          <w:lang w:val="af-ZA"/>
-        </w:rPr>
-        <w:t xml:space="preserve"> </w:t>
-      </w:r>
-      <w:r>
-        <w:rPr>
-          <w:rFonts w:ascii="Sylfaen" w:hAnsi="Sylfaen"/>
-          <w:b/>
-          <w:sz w:val="28"/>
-        </w:rPr>
-        <w:t>վրա</w:t>
-      </w:r>
-      <w:r>
-        <w:rPr>
-          <w:rFonts w:ascii="Sylfaen" w:hAnsi="Sylfaen"/>
-          <w:b/>
-          <w:sz w:val="28"/>
-          <w:lang w:val="af-ZA"/>
-        </w:rPr>
-        <w:t xml:space="preserve"> </w:t>
-      </w:r>
-      <w:r>
-        <w:rPr>
-          <w:rFonts w:ascii="Sylfaen" w:hAnsi="Sylfaen"/>
-          <w:b/>
-          <w:sz w:val="28"/>
-        </w:rPr>
-        <w:t>և</w:t>
-      </w:r>
-      <w:r>
-        <w:rPr>
-          <w:rFonts w:ascii="Sylfaen" w:hAnsi="Sylfaen"/>
-          <w:b/>
-          <w:sz w:val="28"/>
-          <w:lang w:val="af-ZA"/>
-        </w:rPr>
-        <w:t xml:space="preserve"> </w:t>
-      </w:r>
-      <w:r>
-        <w:rPr>
-          <w:rFonts w:ascii="Sylfaen" w:hAnsi="Sylfaen"/>
-          <w:b/>
-          <w:sz w:val="28"/>
-        </w:rPr>
-        <w:t>կայուն</w:t>
-      </w:r>
-      <w:r>
-        <w:rPr>
-          <w:rFonts w:ascii="Sylfaen" w:hAnsi="Sylfaen"/>
-          <w:b/>
-          <w:sz w:val="28"/>
-          <w:lang w:val="af-ZA"/>
-        </w:rPr>
-        <w:t xml:space="preserve"> </w:t>
-      </w:r>
-      <w:r>
-        <w:rPr>
-          <w:rFonts w:ascii="Sylfaen" w:hAnsi="Sylfaen"/>
-          <w:b/>
-          <w:sz w:val="28"/>
-        </w:rPr>
-        <w:t>զարգացման</w:t>
-      </w:r>
-      <w:r>
-        <w:rPr>
-          <w:rFonts w:ascii="Sylfaen" w:hAnsi="Sylfaen"/>
-          <w:b/>
-          <w:sz w:val="28"/>
-          <w:lang w:val="af-ZA"/>
-        </w:rPr>
-        <w:t xml:space="preserve"> </w:t>
-      </w:r>
-      <w:r>
-        <w:rPr>
-          <w:rFonts w:ascii="Sylfaen" w:hAnsi="Sylfaen"/>
-          <w:b/>
-          <w:sz w:val="28"/>
-        </w:rPr>
-        <w:t>հեռանկարները</w:t>
+          <w:lang w:val="hy-AM"/>
+        </w:rPr>
+        <w:t>ՀԱՄԱԿԱՐԳԵՐԻ ԱԶԴԵՑՈՒԹՅՈՒՆԸ ԷԿՈԼՈԳԻԱՅԻ ՎՐԱ ԵՎ ԿԱՅՈՒՆ ԶԱՐԳԱՑՄԱՆ ՀԵՌԱՆԿԱՐՆԵՐԸ</w:t>
       </w:r>
     </w:p>
     <w:p>
@@ -14701,6 +14489,7 @@
   <w:style w:type="paragraph" w:default="1" w:styleId="Normal">
     <w:name w:val="Normal"/>
     <w:qFormat/>
+    <w:rsid w:val="00681303"/>
   </w:style>
   <w:style w:type="character" w:default="1" w:styleId="DefaultParagraphFont">
     <w:name w:val="Default Paragraph Font"/>

</xml_diff>